<commit_message>
dev: backup test files
(commit to be ditched later in a branch cleaning process if the code is validated as usefull for the pipeline project)
</commit_message>
<xml_diff>
--- a/testfiles/default_sample_for_dtbook_conversion.docx
+++ b/testfiles/default_sample_for_dtbook_conversion.docx
@@ -1160,7 +1160,7 @@
         </w:rPr>
         <w:t xml:space="preserve"> </w:t>
       </w:r>
-      <w:bookmarkStart w:id="3" w:name="Abbreviations5019654367602899514"/>
+      <w:bookmarkStart w:id="5" w:name="Abbreviations5019654367602899514"/>
       <w:r>
         <w:rPr>
           <w:rFonts w:asciiTheme="majorHAnsi" w:hAnsiTheme="majorHAnsi" w:cstheme="majorHAnsi"/>
@@ -1168,7 +1168,7 @@
         </w:rPr>
         <w:t>etc.</w:t>
       </w:r>
-      <w:bookmarkEnd w:id="3"/>
+      <w:bookmarkEnd w:id="5"/>
       <w:r>
         <w:rPr>
           <w:rFonts w:asciiTheme="majorHAnsi" w:hAnsiTheme="majorHAnsi" w:cstheme="majorHAnsi"/>
@@ -1192,7 +1192,7 @@
         </w:rPr>
         <w:t xml:space="preserve">Or I need to use </w:t>
       </w:r>
-      <w:bookmarkStart w:id="4" w:name="Abbreviations5337448117425534445"/>
+      <w:bookmarkStart w:id="6" w:name="Abbreviations5337448117425534445"/>
       <w:r>
         <w:rPr>
           <w:rFonts w:asciiTheme="majorHAnsi" w:hAnsiTheme="majorHAnsi" w:cstheme="majorHAnsi"/>
@@ -1200,7 +1200,7 @@
         </w:rPr>
         <w:t>etal.</w:t>
       </w:r>
-      <w:bookmarkEnd w:id="4"/>
+      <w:bookmarkEnd w:id="6"/>
       <w:r>
         <w:rPr>
           <w:rFonts w:asciiTheme="majorHAnsi" w:hAnsiTheme="majorHAnsi" w:cstheme="majorHAnsi"/>
@@ -1224,7 +1224,7 @@
         </w:rPr>
         <w:t xml:space="preserve">And then I use it again here: </w:t>
       </w:r>
-      <w:bookmarkStart w:id="5" w:name="Abbreviations4687551102882176760"/>
+      <w:bookmarkStart w:id="7" w:name="Abbreviations4687551102882176760"/>
       <w:r>
         <w:rPr>
           <w:rFonts w:asciiTheme="majorHAnsi" w:hAnsiTheme="majorHAnsi" w:cstheme="majorHAnsi"/>
@@ -1232,7 +1232,7 @@
         </w:rPr>
         <w:t>etal.</w:t>
       </w:r>
-      <w:bookmarkEnd w:id="5"/>
+      <w:bookmarkEnd w:id="7"/>
       <w:r>
         <w:rPr>
           <w:rFonts w:asciiTheme="majorHAnsi" w:hAnsiTheme="majorHAnsi" w:cstheme="majorHAnsi"/>
@@ -1240,7 +1240,7 @@
         </w:rPr>
         <w:t xml:space="preserve"> and </w:t>
       </w:r>
-      <w:bookmarkStart w:id="6" w:name="Abbreviations5377627517227795381"/>
+      <w:bookmarkStart w:id="8" w:name="Abbreviations5377627517227795381"/>
       <w:r>
         <w:rPr>
           <w:rFonts w:asciiTheme="majorHAnsi" w:hAnsiTheme="majorHAnsi" w:cstheme="majorHAnsi"/>
@@ -1248,7 +1248,7 @@
         </w:rPr>
         <w:t>etc.</w:t>
       </w:r>
-      <w:bookmarkEnd w:id="6"/>
+      <w:bookmarkEnd w:id="8"/>
       <w:r>
         <w:rPr>
           <w:rFonts w:asciiTheme="majorHAnsi" w:hAnsiTheme="majorHAnsi" w:cstheme="majorHAnsi"/>
@@ -1272,7 +1272,7 @@
         </w:rPr>
         <w:t xml:space="preserve">Now let use an acronym, like </w:t>
       </w:r>
-      <w:bookmarkStart w:id="7" w:name="AcronymsYes5217018880860573923"/>
+      <w:bookmarkStart w:id="9" w:name="AcronymsYes5217018880860573923"/>
       <w:r>
         <w:rPr>
           <w:rFonts w:asciiTheme="majorHAnsi" w:hAnsiTheme="majorHAnsi" w:cstheme="majorHAnsi"/>
@@ -1280,7 +1280,7 @@
         </w:rPr>
         <w:t>IEEE</w:t>
       </w:r>
-      <w:bookmarkEnd w:id="7"/>
+      <w:bookmarkEnd w:id="9"/>
       <w:r>
         <w:rPr>
           <w:rFonts w:asciiTheme="majorHAnsi" w:hAnsiTheme="majorHAnsi" w:cstheme="majorHAnsi"/>
@@ -1288,7 +1288,7 @@
         </w:rPr>
         <w:t xml:space="preserve"> or </w:t>
       </w:r>
-      <w:bookmarkStart w:id="8" w:name="AcronymsYes4986238613562909951"/>
+      <w:bookmarkStart w:id="10" w:name="AcronymsYes4986238613562909951"/>
       <w:r>
         <w:rPr>
           <w:rFonts w:asciiTheme="majorHAnsi" w:hAnsiTheme="majorHAnsi" w:cstheme="majorHAnsi"/>
@@ -1296,7 +1296,7 @@
         </w:rPr>
         <w:t>DAISY</w:t>
       </w:r>
-      <w:bookmarkEnd w:id="8"/>
+      <w:bookmarkEnd w:id="10"/>
       <w:r>
         <w:rPr>
           <w:rFonts w:asciiTheme="majorHAnsi" w:hAnsiTheme="majorHAnsi" w:cstheme="majorHAnsi"/>
@@ -1304,7 +1304,7 @@
         </w:rPr>
         <w:t xml:space="preserve">, and lets reuse </w:t>
       </w:r>
-      <w:bookmarkStart w:id="9" w:name="AcronymsYes5703539723210207112"/>
+      <w:bookmarkStart w:id="11" w:name="AcronymsYes5703539723210207112"/>
       <w:r>
         <w:rPr>
           <w:rFonts w:asciiTheme="majorHAnsi" w:hAnsiTheme="majorHAnsi" w:cstheme="majorHAnsi"/>
@@ -1312,13 +1312,68 @@
         </w:rPr>
         <w:t>IEEE</w:t>
       </w:r>
-      <w:bookmarkEnd w:id="9"/>
+      <w:bookmarkEnd w:id="11"/>
       <w:r>
         <w:rPr>
           <w:rFonts w:asciiTheme="majorHAnsi" w:hAnsiTheme="majorHAnsi" w:cstheme="majorHAnsi"/>
           <w:lang w:val="en-US"/>
         </w:rPr>
         <w:t>.</w:t>
+      </w:r>
+    </w:p>
+    <w:p>
+      <w:pPr>
+        <w:pStyle w:val="BlockquoteDAISY"/>
+      </w:pPr>
+      <w:r>
+        <w:t>This is a simple quote</w:t>
+      </w:r>
+      <w:r>
+        <w:t xml:space="preserve"> for testing</w:t>
+      </w:r>
+    </w:p>
+    <w:p>
+      <w:pPr>
+        <w:pStyle w:val="Blockquote-AuthorDAISY"/>
+      </w:pPr>
+      <w:r>
+        <w:t>N.P.</w:t>
+      </w:r>
+    </w:p>
+    <w:p>
+      <w:pPr>
+        <w:pStyle w:val="ListParagraph"/>
+        <w:numPr>
+          <w:ilvl w:val="0"/>
+          <w:numId w:val="1"/>
+        </w:numPr>
+        <w:rPr>
+          <w:lang w:val="sv-SE" w:eastAsia="sv-SE"/>
+        </w:rPr>
+      </w:pPr>
+      <w:r>
+        <w:rPr>
+          <w:lang w:val="sv-SE" w:eastAsia="sv-SE"/>
+        </w:rPr>
+        <w:t>With a list following for a bugfix evaluation</w:t>
+      </w:r>
+    </w:p>
+    <w:p>
+      <w:pPr>
+        <w:pStyle w:val="ListParagraph"/>
+        <w:numPr>
+          <w:ilvl w:val="0"/>
+          <w:numId w:val="1"/>
+        </w:numPr>
+        <w:rPr>
+          <w:lang w:val="sv-SE" w:eastAsia="sv-SE"/>
+        </w:rPr>
+      </w:pPr>
+      <w:r>
+        <w:rPr>
+          <w:lang w:val="sv-SE" w:eastAsia="sv-SE"/>
+        </w:rPr>
+        <w:t>blablabla</w:t>
       </w:r>
     </w:p>
     <w:p>
@@ -1378,6 +1433,7 @@
         <w:pStyle w:val="Sidebarheader-RequiredDAISY"/>
       </w:pPr>
       <w:r>
+        <w:lastRenderedPageBreak/>
         <w:t>This is a head for</w:t>
       </w:r>
     </w:p>
@@ -1391,10 +1447,10 @@
     </w:p>
     <w:p>
       <w:pPr>
-        <w:pStyle w:val="Poem-TitleDAISY"/>
+        <w:pStyle w:val="PoemDAISY"/>
       </w:pPr>
       <w:r>
-        <w:t>My beautiful Poem</w:t>
+        <w:t>This is a simple poem.</w:t>
       </w:r>
     </w:p>
     <w:p>
@@ -1402,48 +1458,7 @@
         <w:pStyle w:val="PoemDAISY"/>
       </w:pPr>
       <w:r>
-        <w:lastRenderedPageBreak/>
-        <w:t>This is a simple poem.</w:t>
-      </w:r>
-    </w:p>
-    <w:p>
-      <w:pPr>
-        <w:pStyle w:val="PoemDAISY"/>
-      </w:pPr>
-      <w:r>
         <w:t>With 2 lines of texte.</w:t>
-      </w:r>
-    </w:p>
-    <w:p>
-      <w:pPr>
-        <w:pStyle w:val="Poem-HeadingDAISY"/>
-      </w:pPr>
-      <w:r>
-        <w:t>And a heading</w:t>
-      </w:r>
-    </w:p>
-    <w:p>
-      <w:pPr>
-        <w:pStyle w:val="PoemDAISY"/>
-      </w:pPr>
-      <w:r>
-        <w:t>Of course this is</w:t>
-      </w:r>
-    </w:p>
-    <w:p>
-      <w:pPr>
-        <w:pStyle w:val="PoemDAISY"/>
-      </w:pPr>
-      <w:r>
-        <w:t>Only for testing</w:t>
-      </w:r>
-    </w:p>
-    <w:p>
-      <w:pPr>
-        <w:pStyle w:val="Poem-AuthorDAISY"/>
-      </w:pPr>
-      <w:r>
-        <w:t>By myself</w:t>
       </w:r>
     </w:p>
     <w:p>
@@ -1509,7 +1524,7 @@
           <w:lang w:val="en-US"/>
         </w:rPr>
       </w:pPr>
-      <w:bookmarkStart w:id="10" w:name="_Toc103675407"/>
+      <w:bookmarkStart w:id="12" w:name="_Toc103675407"/>
       <w:r>
         <w:rPr>
           <w:lang w:val="en-US"/>
@@ -1522,7 +1537,7 @@
         </w:rPr>
         <w:t>breaks</w:t>
       </w:r>
-      <w:bookmarkEnd w:id="10"/>
+      <w:bookmarkEnd w:id="12"/>
     </w:p>
     <w:p>
       <w:pPr>
@@ -1719,7 +1734,7 @@
           <w:lang w:val="en-US"/>
         </w:rPr>
       </w:pPr>
-      <w:bookmarkStart w:id="11" w:name="_Toc103675408"/>
+      <w:bookmarkStart w:id="13" w:name="_Toc103675408"/>
       <w:r>
         <w:rPr>
           <w:lang w:val="en-US"/>
@@ -1727,7 +1742,7 @@
         <w:lastRenderedPageBreak/>
         <w:t>Eléments and objects</w:t>
       </w:r>
-      <w:bookmarkEnd w:id="11"/>
+      <w:bookmarkEnd w:id="13"/>
     </w:p>
     <w:p>
       <w:pPr>
@@ -1736,14 +1751,14 @@
           <w:lang w:val="en-US"/>
         </w:rPr>
       </w:pPr>
-      <w:bookmarkStart w:id="12" w:name="_Toc103675409"/>
+      <w:bookmarkStart w:id="14" w:name="_Toc103675409"/>
       <w:r>
         <w:rPr>
           <w:lang w:val="en-US"/>
         </w:rPr>
         <w:t>Images</w:t>
       </w:r>
-      <w:bookmarkEnd w:id="12"/>
+      <w:bookmarkEnd w:id="14"/>
     </w:p>
     <w:p>
       <w:pPr>
@@ -1787,7 +1802,7 @@
                     </pic:cNvPicPr>
                   </pic:nvPicPr>
                   <pic:blipFill>
-                    <a:blip r:embed="rId8" cstate="print">
+                    <a:blip r:embed="rId9" cstate="print">
                       <a:extLst>
                         <a:ext uri="{28A0092B-C50C-407E-A947-70E740481C1C}">
                           <a14:useLocalDpi xmlns:a14="http://schemas.microsoft.com/office/drawing/2010/main" val="0"/>
@@ -1862,7 +1877,7 @@
                     </pic:cNvPicPr>
                   </pic:nvPicPr>
                   <pic:blipFill>
-                    <a:blip r:embed="rId9" cstate="print">
+                    <a:blip r:embed="rId10" cstate="print">
                       <a:extLst>
                         <a:ext uri="{28A0092B-C50C-407E-A947-70E740481C1C}">
                           <a14:useLocalDpi xmlns:a14="http://schemas.microsoft.com/office/drawing/2010/main" val="0"/>
@@ -1935,7 +1950,7 @@
                     </pic:cNvPicPr>
                   </pic:nvPicPr>
                   <pic:blipFill>
-                    <a:blip r:embed="rId10" cstate="print">
+                    <a:blip r:embed="rId11" cstate="print">
                       <a:extLst>
                         <a:ext uri="{28A0092B-C50C-407E-A947-70E740481C1C}">
                           <a14:useLocalDpi xmlns:a14="http://schemas.microsoft.com/office/drawing/2010/main" val="0"/>
@@ -1995,7 +2010,7 @@
                     </pic:cNvPicPr>
                   </pic:nvPicPr>
                   <pic:blipFill>
-                    <a:blip r:embed="rId11" cstate="print">
+                    <a:blip r:embed="rId12" cstate="print">
                       <a:extLst>
                         <a:ext uri="{28A0092B-C50C-407E-A947-70E740481C1C}">
                           <a14:useLocalDpi xmlns:a14="http://schemas.microsoft.com/office/drawing/2010/main" val="0"/>
@@ -2206,7 +2221,7 @@
                   <w:txbxContent>
                     <w:p>
                       <w:pPr>
-                        <w:pStyle w:val="Caption"/>
+                        <w:pStyle w:val="Lgende"/>
                         <w:rPr>
                           <w:noProof/>
                         </w:rPr>
@@ -2277,7 +2292,7 @@
             <wp:cNvGraphicFramePr/>
             <a:graphic xmlns:a="http://schemas.openxmlformats.org/drawingml/2006/main">
               <a:graphicData uri="http://schemas.openxmlformats.org/drawingml/2006/diagram">
-                <dgm:relIds xmlns:dgm="http://schemas.openxmlformats.org/drawingml/2006/diagram" xmlns:r="http://schemas.openxmlformats.org/officeDocument/2006/relationships" r:dm="rId12" r:lo="rId13" r:qs="rId14" r:cs="rId15"/>
+                <dgm:relIds xmlns:dgm="http://schemas.openxmlformats.org/drawingml/2006/diagram" xmlns:r="http://schemas.openxmlformats.org/officeDocument/2006/relationships" r:dm="rId13" r:lo="rId14" r:qs="rId15" r:cs="rId16"/>
               </a:graphicData>
             </a:graphic>
           </wp:inline>
@@ -2363,7 +2378,7 @@
             <wp:cNvGraphicFramePr/>
             <a:graphic xmlns:a="http://schemas.openxmlformats.org/drawingml/2006/main">
               <a:graphicData uri="http://schemas.openxmlformats.org/drawingml/2006/chart">
-                <c:chart xmlns:c="http://schemas.openxmlformats.org/drawingml/2006/chart" xmlns:r="http://schemas.openxmlformats.org/officeDocument/2006/relationships" r:id="rId17"/>
+                <c:chart xmlns:c="http://schemas.openxmlformats.org/drawingml/2006/chart" xmlns:r="http://schemas.openxmlformats.org/officeDocument/2006/relationships" r:id="rId18"/>
               </a:graphicData>
             </a:graphic>
           </wp:inline>
@@ -2377,14 +2392,14 @@
           <w:lang w:val="en-US"/>
         </w:rPr>
       </w:pPr>
-      <w:bookmarkStart w:id="13" w:name="_Toc103675410"/>
+      <w:bookmarkStart w:id="15" w:name="_Toc103675410"/>
       <w:r>
         <w:rPr>
           <w:lang w:val="en-US"/>
         </w:rPr>
         <w:t>Equations</w:t>
       </w:r>
-      <w:bookmarkEnd w:id="13"/>
+      <w:bookmarkEnd w:id="15"/>
     </w:p>
     <w:p>
       <w:pPr>
@@ -2618,14 +2633,14 @@
           <w:lang w:val="en-US"/>
         </w:rPr>
       </w:pPr>
-      <w:bookmarkStart w:id="14" w:name="_Toc103675411"/>
+      <w:bookmarkStart w:id="16" w:name="_Toc103675411"/>
       <w:r>
         <w:rPr>
           <w:lang w:val="en-US"/>
         </w:rPr>
         <w:t>Tables</w:t>
       </w:r>
-      <w:bookmarkEnd w:id="14"/>
+      <w:bookmarkEnd w:id="16"/>
     </w:p>
     <w:p>
       <w:pPr>
@@ -4123,6 +4138,40 @@
         </w:rPr>
         <w:t xml:space="preserve"> This is a simple footnote with some text</w:t>
       </w:r>
+      <w:r>
+        <w:rPr>
+          <w:lang w:val="en-US"/>
+        </w:rPr>
+        <w:t xml:space="preserve"> and an abbreviation </w:t>
+      </w:r>
+      <w:bookmarkStart w:id="3" w:name="Abbreviations5555467692023640526"/>
+      <w:r>
+        <w:rPr>
+          <w:lang w:val="en-US"/>
+        </w:rPr>
+        <w:t>etc.</w:t>
+      </w:r>
+      <w:bookmarkEnd w:id="3"/>
+      <w:r>
+        <w:rPr>
+          <w:lang w:val="en-US"/>
+        </w:rPr>
+        <w:t xml:space="preserve"> and an acronym </w:t>
+      </w:r>
+      <w:bookmarkStart w:id="4" w:name="AcronymsNo5400092294780659364"/>
+      <w:r>
+        <w:rPr>
+          <w:lang w:val="en-US"/>
+        </w:rPr>
+        <w:t>T.T.</w:t>
+      </w:r>
+      <w:bookmarkEnd w:id="4"/>
+      <w:r>
+        <w:rPr>
+          <w:lang w:val="en-US"/>
+        </w:rPr>
+        <w:t xml:space="preserve"> in a footnote.</w:t>
+      </w:r>
     </w:p>
   </w:footnote>
   <w:footnote w:id="2">
@@ -4163,6 +4212,127 @@
     </w:p>
   </w:footnote>
 </w:footnotes>
+</file>
+
+<file path=word/numbering.xml><?xml version="1.0" encoding="utf-8"?>
+<w:numbering xmlns:wpc="http://schemas.microsoft.com/office/word/2010/wordprocessingCanvas" xmlns:cx="http://schemas.microsoft.com/office/drawing/2014/chartex" xmlns:cx1="http://schemas.microsoft.com/office/drawing/2015/9/8/chartex" xmlns:cx2="http://schemas.microsoft.com/office/drawing/2015/10/21/chartex" xmlns:cx3="http://schemas.microsoft.com/office/drawing/2016/5/9/chartex" xmlns:cx4="http://schemas.microsoft.com/office/drawing/2016/5/10/chartex" xmlns:cx5="http://schemas.microsoft.com/office/drawing/2016/5/11/chartex" xmlns:cx6="http://schemas.microsoft.com/office/drawing/2016/5/12/chartex" xmlns:cx7="http://schemas.microsoft.com/office/drawing/2016/5/13/chartex" xmlns:cx8="http://schemas.microsoft.com/office/drawing/2016/5/14/chartex" xmlns:mc="http://schemas.openxmlformats.org/markup-compatibility/2006" xmlns:aink="http://schemas.microsoft.com/office/drawing/2016/ink" xmlns:am3d="http://schemas.microsoft.com/office/drawing/2017/model3d" xmlns:o="urn:schemas-microsoft-com:office:office" xmlns:oel="http://schemas.microsoft.com/office/2019/extlst" xmlns:r="http://schemas.openxmlformats.org/officeDocument/2006/relationships" xmlns:m="http://schemas.openxmlformats.org/officeDocument/2006/math" xmlns:v="urn:schemas-microsoft-com:vml" xmlns:wp14="http://schemas.microsoft.com/office/word/2010/wordprocessingDrawing" xmlns:wp="http://schemas.openxmlformats.org/drawingml/2006/wordprocessingDrawing" xmlns:w10="urn:schemas-microsoft-com:office:word" xmlns:w="http://schemas.openxmlformats.org/wordprocessingml/2006/main" xmlns:w14="http://schemas.microsoft.com/office/word/2010/wordml" xmlns:w15="http://schemas.microsoft.com/office/word/2012/wordml" xmlns:w16cex="http://schemas.microsoft.com/office/word/2018/wordml/cex" xmlns:w16cid="http://schemas.microsoft.com/office/word/2016/wordml/cid" xmlns:w16="http://schemas.microsoft.com/office/word/2018/wordml" xmlns:w16du="http://schemas.microsoft.com/office/word/2023/wordml/word16du" xmlns:w16sdtdh="http://schemas.microsoft.com/office/word/2020/wordml/sdtdatahash" xmlns:w16sdtfl="http://schemas.microsoft.com/office/word/2024/wordml/sdtformatlock" xmlns:w16se="http://schemas.microsoft.com/office/word/2015/wordml/symex" xmlns:wpg="http://schemas.microsoft.com/office/word/2010/wordprocessingGroup" xmlns:wpi="http://schemas.microsoft.com/office/word/2010/wordprocessingInk" xmlns:wne="http://schemas.microsoft.com/office/word/2006/wordml" xmlns:wps="http://schemas.microsoft.com/office/word/2010/wordprocessingShape" mc:Ignorable="w14 w15 w16se w16cid w16 w16cex w16sdtdh w16sdtfl w16du wp14">
+  <w:abstractNum w:abstractNumId="0" w15:restartNumberingAfterBreak="0">
+    <w:nsid w:val="0F804D8E"/>
+    <w:multiLevelType w:val="hybridMultilevel"/>
+    <w:tmpl w:val="2048F604"/>
+    <w:lvl w:ilvl="0" w:tplc="040C0001">
+      <w:start w:val="1"/>
+      <w:numFmt w:val="bullet"/>
+      <w:lvlText w:val=""/>
+      <w:lvlJc w:val="left"/>
+      <w:pPr>
+        <w:ind w:left="720" w:hanging="360"/>
+      </w:pPr>
+      <w:rPr>
+        <w:rFonts w:ascii="Symbol" w:hAnsi="Symbol" w:hint="default"/>
+      </w:rPr>
+    </w:lvl>
+    <w:lvl w:ilvl="1" w:tplc="040C0003" w:tentative="1">
+      <w:start w:val="1"/>
+      <w:numFmt w:val="bullet"/>
+      <w:lvlText w:val="o"/>
+      <w:lvlJc w:val="left"/>
+      <w:pPr>
+        <w:ind w:left="1440" w:hanging="360"/>
+      </w:pPr>
+      <w:rPr>
+        <w:rFonts w:ascii="Courier New" w:hAnsi="Courier New" w:cs="Courier New" w:hint="default"/>
+      </w:rPr>
+    </w:lvl>
+    <w:lvl w:ilvl="2" w:tplc="040C0005" w:tentative="1">
+      <w:start w:val="1"/>
+      <w:numFmt w:val="bullet"/>
+      <w:lvlText w:val=""/>
+      <w:lvlJc w:val="left"/>
+      <w:pPr>
+        <w:ind w:left="2160" w:hanging="360"/>
+      </w:pPr>
+      <w:rPr>
+        <w:rFonts w:ascii="Wingdings" w:hAnsi="Wingdings" w:hint="default"/>
+      </w:rPr>
+    </w:lvl>
+    <w:lvl w:ilvl="3" w:tplc="040C0001" w:tentative="1">
+      <w:start w:val="1"/>
+      <w:numFmt w:val="bullet"/>
+      <w:lvlText w:val=""/>
+      <w:lvlJc w:val="left"/>
+      <w:pPr>
+        <w:ind w:left="2880" w:hanging="360"/>
+      </w:pPr>
+      <w:rPr>
+        <w:rFonts w:ascii="Symbol" w:hAnsi="Symbol" w:hint="default"/>
+      </w:rPr>
+    </w:lvl>
+    <w:lvl w:ilvl="4" w:tplc="040C0003" w:tentative="1">
+      <w:start w:val="1"/>
+      <w:numFmt w:val="bullet"/>
+      <w:lvlText w:val="o"/>
+      <w:lvlJc w:val="left"/>
+      <w:pPr>
+        <w:ind w:left="3600" w:hanging="360"/>
+      </w:pPr>
+      <w:rPr>
+        <w:rFonts w:ascii="Courier New" w:hAnsi="Courier New" w:cs="Courier New" w:hint="default"/>
+      </w:rPr>
+    </w:lvl>
+    <w:lvl w:ilvl="5" w:tplc="040C0005" w:tentative="1">
+      <w:start w:val="1"/>
+      <w:numFmt w:val="bullet"/>
+      <w:lvlText w:val=""/>
+      <w:lvlJc w:val="left"/>
+      <w:pPr>
+        <w:ind w:left="4320" w:hanging="360"/>
+      </w:pPr>
+      <w:rPr>
+        <w:rFonts w:ascii="Wingdings" w:hAnsi="Wingdings" w:hint="default"/>
+      </w:rPr>
+    </w:lvl>
+    <w:lvl w:ilvl="6" w:tplc="040C0001" w:tentative="1">
+      <w:start w:val="1"/>
+      <w:numFmt w:val="bullet"/>
+      <w:lvlText w:val=""/>
+      <w:lvlJc w:val="left"/>
+      <w:pPr>
+        <w:ind w:left="5040" w:hanging="360"/>
+      </w:pPr>
+      <w:rPr>
+        <w:rFonts w:ascii="Symbol" w:hAnsi="Symbol" w:hint="default"/>
+      </w:rPr>
+    </w:lvl>
+    <w:lvl w:ilvl="7" w:tplc="040C0003" w:tentative="1">
+      <w:start w:val="1"/>
+      <w:numFmt w:val="bullet"/>
+      <w:lvlText w:val="o"/>
+      <w:lvlJc w:val="left"/>
+      <w:pPr>
+        <w:ind w:left="5760" w:hanging="360"/>
+      </w:pPr>
+      <w:rPr>
+        <w:rFonts w:ascii="Courier New" w:hAnsi="Courier New" w:cs="Courier New" w:hint="default"/>
+      </w:rPr>
+    </w:lvl>
+    <w:lvl w:ilvl="8" w:tplc="040C0005" w:tentative="1">
+      <w:start w:val="1"/>
+      <w:numFmt w:val="bullet"/>
+      <w:lvlText w:val=""/>
+      <w:lvlJc w:val="left"/>
+      <w:pPr>
+        <w:ind w:left="6480" w:hanging="360"/>
+      </w:pPr>
+      <w:rPr>
+        <w:rFonts w:ascii="Wingdings" w:hAnsi="Wingdings" w:hint="default"/>
+      </w:rPr>
+    </w:lvl>
+  </w:abstractNum>
+  <w:num w:numId="1" w16cid:durableId="2024814765">
+    <w:abstractNumId w:val="0"/>
+  </w:num>
+</w:numbering>
 </file>
 
 <file path=word/styles.xml><?xml version="1.0" encoding="utf-8"?>
@@ -5654,6 +5824,17 @@
       <w:u w:val="single"/>
     </w:rPr>
   </w:style>
+  <w:style w:type="paragraph" w:styleId="ListParagraph">
+    <w:name w:val="List Paragraph"/>
+    <w:basedOn w:val="Normal"/>
+    <w:uiPriority w:val="34"/>
+    <w:qFormat/>
+    <w:rsid w:val="004E5AEA"/>
+    <w:pPr>
+      <w:ind w:left="720"/>
+      <w:contextualSpacing/>
+    </w:pPr>
+  </w:style>
 </w:styles>
 </file>
 
@@ -7601,7 +7782,7 @@
   <dgm:whole/>
   <dgm:extLst>
     <a:ext uri="http://schemas.microsoft.com/office/drawing/2008/diagram">
-      <dsp:dataModelExt xmlns:dsp="http://schemas.microsoft.com/office/drawing/2008/diagram" relId="rId16" minVer="http://schemas.openxmlformats.org/drawingml/2006/diagram"/>
+      <dsp:dataModelExt xmlns:dsp="http://schemas.microsoft.com/office/drawing/2008/diagram" relId="rId17" minVer="http://schemas.openxmlformats.org/drawingml/2006/diagram"/>
     </a:ext>
   </dgm:extLst>
 </dgm:dataModel>
@@ -9485,11 +9666,13 @@
     <Item AbbreviationName="Abbreviations4687551102882176760" FullAbbr="Et Alimony" OriginalText="etal."/>
     <Item AbbreviationName="Abbreviations5019654367602899514" FullAbbr="et caetera" OriginalText="etc."/>
     <Item AbbreviationName="Abbreviations5377627517227795381" FullAbbr="et caetera" OriginalText="etc."/>
+    <Item AbbreviationName="Abbreviations5555467692023640526" FullAbbr="etcaetera" OriginalText="etc."/>
   </Abbreviations>
   <Acronyms>
     <Item AcronymName="AcronymsYes5217018880860573923" FullAcr="Institute of Electrical and Electronic Engineers" OriginalText="IEEE"/>
     <Item AcronymName="AcronymsYes5703539723210207112" FullAcr="Institute of Electrical and Electronic Engineers" OriginalText="IEEE"/>
     <Item AcronymName="AcronymsYes4986238613562909951" FullAcr="Digital Accessible Information System" OriginalText="DAISY"/>
+    <Item AcronymName="AcronymsNo5400092294780659364" FullAcr="Time Travel" OriginalText="T.T."/>
   </Acronyms>
 </Manage>
 </file>
@@ -9503,7 +9686,7 @@
 </file>
 
 <file path=customXml/itemProps2.xml><?xml version="1.0" encoding="utf-8"?>
-<ds:datastoreItem xmlns:ds="http://schemas.openxmlformats.org/officeDocument/2006/customXml" ds:itemID="{E73164F4-65B2-4B8D-BB0F-DA226291539F}">
+<ds:datastoreItem xmlns:ds="http://schemas.openxmlformats.org/officeDocument/2006/customXml" ds:itemID="{C74442D8-3FE4-406F-858C-D95076610E13}">
   <ds:schemaRefs>
     <ds:schemaRef ds:uri="http://Daisy-OpenXML/customxml"/>
   </ds:schemaRefs>

</xml_diff>